<commit_message>
Finalize SoftwareX author and declaration metadata
</commit_message>
<xml_diff>
--- a/docs/submission/word/COVER_LETTER.docx
+++ b/docs/submission/word/COVER_LETTER.docx
@@ -47,7 +47,7 @@
     </w:p>
     <w:p>
       <w:r>
-        <w:t>The manuscript is original, is not under consideration elsewhere, and has been approved by all authors. [CONFIRM BEFORE SUBMISSION]</w:t>
+        <w:t>The manuscript is original, is not under consideration elsewhere, and has been approved by all authors.</w:t>
       </w:r>
     </w:p>
     <w:p>
@@ -62,7 +62,7 @@
     </w:p>
     <w:p>
       <w:r>
-        <w:t>Nikolaos Marmaras   Corresponding author   Hellenic Open University   [CORRESPONDING EMAIL]   [POSTAL ADDRESS, IF REQUIRED]</w:t>
+        <w:t>Nikolaos Marmaras   Corresponding author   Hellenic Open University   nikolaos.marmaras@ac.eap.gr https://orcid.org/0009-0007-1714-4026</w:t>
       </w:r>
     </w:p>
     <w:p>
@@ -493,7 +493,7 @@
     <w:link w:val="Heading1Char"/>
     <w:uiPriority w:val="9"/>
     <w:qFormat/>
-    <w:rsid w:val="00A04ADF"/>
+    <w:rsid w:val="00686291"/>
     <w:pPr>
       <w:keepNext/>
       <w:keepLines/>
@@ -516,7 +516,7 @@
     <w:semiHidden/>
     <w:unhideWhenUsed/>
     <w:qFormat/>
-    <w:rsid w:val="00A04ADF"/>
+    <w:rsid w:val="00686291"/>
     <w:pPr>
       <w:keepNext/>
       <w:keepLines/>
@@ -539,7 +539,7 @@
     <w:semiHidden/>
     <w:unhideWhenUsed/>
     <w:qFormat/>
-    <w:rsid w:val="00A04ADF"/>
+    <w:rsid w:val="00686291"/>
     <w:pPr>
       <w:keepNext/>
       <w:keepLines/>
@@ -562,7 +562,7 @@
     <w:semiHidden/>
     <w:unhideWhenUsed/>
     <w:qFormat/>
-    <w:rsid w:val="00A04ADF"/>
+    <w:rsid w:val="00686291"/>
     <w:pPr>
       <w:keepNext/>
       <w:keepLines/>
@@ -585,7 +585,7 @@
     <w:semiHidden/>
     <w:unhideWhenUsed/>
     <w:qFormat/>
-    <w:rsid w:val="00A04ADF"/>
+    <w:rsid w:val="00686291"/>
     <w:pPr>
       <w:keepNext/>
       <w:keepLines/>
@@ -606,7 +606,7 @@
     <w:semiHidden/>
     <w:unhideWhenUsed/>
     <w:qFormat/>
-    <w:rsid w:val="00A04ADF"/>
+    <w:rsid w:val="00686291"/>
     <w:pPr>
       <w:keepNext/>
       <w:keepLines/>
@@ -629,7 +629,7 @@
     <w:semiHidden/>
     <w:unhideWhenUsed/>
     <w:qFormat/>
-    <w:rsid w:val="00A04ADF"/>
+    <w:rsid w:val="00686291"/>
     <w:pPr>
       <w:keepNext/>
       <w:keepLines/>
@@ -650,7 +650,7 @@
     <w:semiHidden/>
     <w:unhideWhenUsed/>
     <w:qFormat/>
-    <w:rsid w:val="00A04ADF"/>
+    <w:rsid w:val="00686291"/>
     <w:pPr>
       <w:keepNext/>
       <w:keepLines/>
@@ -673,7 +673,7 @@
     <w:semiHidden/>
     <w:unhideWhenUsed/>
     <w:qFormat/>
-    <w:rsid w:val="00A04ADF"/>
+    <w:rsid w:val="00686291"/>
     <w:pPr>
       <w:keepNext/>
       <w:keepLines/>
@@ -717,7 +717,7 @@
     <w:basedOn w:val="DefaultParagraphFont"/>
     <w:link w:val="Heading1"/>
     <w:uiPriority w:val="9"/>
-    <w:rsid w:val="00A04ADF"/>
+    <w:rsid w:val="00686291"/>
     <w:rPr>
       <w:rFonts w:asciiTheme="majorHAnsi" w:eastAsiaTheme="majorEastAsia" w:hAnsiTheme="majorHAnsi" w:cstheme="majorBidi"/>
       <w:color w:val="0F4761" w:themeColor="accent1" w:themeShade="BF"/>
@@ -731,7 +731,7 @@
     <w:link w:val="Heading2"/>
     <w:uiPriority w:val="9"/>
     <w:semiHidden/>
-    <w:rsid w:val="00A04ADF"/>
+    <w:rsid w:val="00686291"/>
     <w:rPr>
       <w:rFonts w:asciiTheme="majorHAnsi" w:eastAsiaTheme="majorEastAsia" w:hAnsiTheme="majorHAnsi" w:cstheme="majorBidi"/>
       <w:color w:val="0F4761" w:themeColor="accent1" w:themeShade="BF"/>
@@ -745,7 +745,7 @@
     <w:link w:val="Heading3"/>
     <w:uiPriority w:val="9"/>
     <w:semiHidden/>
-    <w:rsid w:val="00A04ADF"/>
+    <w:rsid w:val="00686291"/>
     <w:rPr>
       <w:rFonts w:eastAsiaTheme="majorEastAsia" w:cstheme="majorBidi"/>
       <w:color w:val="0F4761" w:themeColor="accent1" w:themeShade="BF"/>
@@ -759,7 +759,7 @@
     <w:link w:val="Heading4"/>
     <w:uiPriority w:val="9"/>
     <w:semiHidden/>
-    <w:rsid w:val="00A04ADF"/>
+    <w:rsid w:val="00686291"/>
     <w:rPr>
       <w:rFonts w:eastAsiaTheme="majorEastAsia" w:cstheme="majorBidi"/>
       <w:i/>
@@ -773,7 +773,7 @@
     <w:link w:val="Heading5"/>
     <w:uiPriority w:val="9"/>
     <w:semiHidden/>
-    <w:rsid w:val="00A04ADF"/>
+    <w:rsid w:val="00686291"/>
     <w:rPr>
       <w:rFonts w:eastAsiaTheme="majorEastAsia" w:cstheme="majorBidi"/>
       <w:color w:val="0F4761" w:themeColor="accent1" w:themeShade="BF"/>
@@ -785,7 +785,7 @@
     <w:link w:val="Heading6"/>
     <w:uiPriority w:val="9"/>
     <w:semiHidden/>
-    <w:rsid w:val="00A04ADF"/>
+    <w:rsid w:val="00686291"/>
     <w:rPr>
       <w:rFonts w:eastAsiaTheme="majorEastAsia" w:cstheme="majorBidi"/>
       <w:i/>
@@ -799,7 +799,7 @@
     <w:link w:val="Heading7"/>
     <w:uiPriority w:val="9"/>
     <w:semiHidden/>
-    <w:rsid w:val="00A04ADF"/>
+    <w:rsid w:val="00686291"/>
     <w:rPr>
       <w:rFonts w:eastAsiaTheme="majorEastAsia" w:cstheme="majorBidi"/>
       <w:color w:val="595959" w:themeColor="text1" w:themeTint="A6"/>
@@ -811,7 +811,7 @@
     <w:link w:val="Heading8"/>
     <w:uiPriority w:val="9"/>
     <w:semiHidden/>
-    <w:rsid w:val="00A04ADF"/>
+    <w:rsid w:val="00686291"/>
     <w:rPr>
       <w:rFonts w:eastAsiaTheme="majorEastAsia" w:cstheme="majorBidi"/>
       <w:i/>
@@ -825,7 +825,7 @@
     <w:link w:val="Heading9"/>
     <w:uiPriority w:val="9"/>
     <w:semiHidden/>
-    <w:rsid w:val="00A04ADF"/>
+    <w:rsid w:val="00686291"/>
     <w:rPr>
       <w:rFonts w:eastAsiaTheme="majorEastAsia" w:cstheme="majorBidi"/>
       <w:color w:val="272727" w:themeColor="text1" w:themeTint="D8"/>
@@ -838,7 +838,7 @@
     <w:link w:val="TitleChar"/>
     <w:uiPriority w:val="10"/>
     <w:qFormat/>
-    <w:rsid w:val="00A04ADF"/>
+    <w:rsid w:val="00686291"/>
     <w:pPr>
       <w:spacing w:after="80" w:line="240" w:lineRule="auto"/>
       <w:contextualSpacing/>
@@ -856,7 +856,7 @@
     <w:basedOn w:val="DefaultParagraphFont"/>
     <w:link w:val="Title"/>
     <w:uiPriority w:val="10"/>
-    <w:rsid w:val="00A04ADF"/>
+    <w:rsid w:val="00686291"/>
     <w:rPr>
       <w:rFonts w:asciiTheme="majorHAnsi" w:eastAsiaTheme="majorEastAsia" w:hAnsiTheme="majorHAnsi" w:cstheme="majorBidi"/>
       <w:spacing w:val="-10"/>
@@ -872,7 +872,7 @@
     <w:link w:val="SubtitleChar"/>
     <w:uiPriority w:val="11"/>
     <w:qFormat/>
-    <w:rsid w:val="00A04ADF"/>
+    <w:rsid w:val="00686291"/>
     <w:pPr>
       <w:numPr>
         <w:ilvl w:val="1"/>
@@ -891,7 +891,7 @@
     <w:basedOn w:val="DefaultParagraphFont"/>
     <w:link w:val="Subtitle"/>
     <w:uiPriority w:val="11"/>
-    <w:rsid w:val="00A04ADF"/>
+    <w:rsid w:val="00686291"/>
     <w:rPr>
       <w:rFonts w:eastAsiaTheme="majorEastAsia" w:cstheme="majorBidi"/>
       <w:color w:val="595959" w:themeColor="text1" w:themeTint="A6"/>
@@ -907,7 +907,7 @@
     <w:link w:val="QuoteChar"/>
     <w:uiPriority w:val="29"/>
     <w:qFormat/>
-    <w:rsid w:val="00A04ADF"/>
+    <w:rsid w:val="00686291"/>
     <w:pPr>
       <w:spacing w:before="160"/>
       <w:jc w:val="center"/>
@@ -923,7 +923,7 @@
     <w:basedOn w:val="DefaultParagraphFont"/>
     <w:link w:val="Quote"/>
     <w:uiPriority w:val="29"/>
-    <w:rsid w:val="00A04ADF"/>
+    <w:rsid w:val="00686291"/>
     <w:rPr>
       <w:i/>
       <w:iCs/>
@@ -935,7 +935,7 @@
     <w:basedOn w:val="Normal"/>
     <w:uiPriority w:val="34"/>
     <w:qFormat/>
-    <w:rsid w:val="00A04ADF"/>
+    <w:rsid w:val="00686291"/>
     <w:pPr>
       <w:ind w:left="720"/>
       <w:contextualSpacing/>
@@ -946,7 +946,7 @@
     <w:basedOn w:val="DefaultParagraphFont"/>
     <w:uiPriority w:val="21"/>
     <w:qFormat/>
-    <w:rsid w:val="00A04ADF"/>
+    <w:rsid w:val="00686291"/>
     <w:rPr>
       <w:i/>
       <w:iCs/>
@@ -960,7 +960,7 @@
     <w:link w:val="IntenseQuoteChar"/>
     <w:uiPriority w:val="30"/>
     <w:qFormat/>
-    <w:rsid w:val="00A04ADF"/>
+    <w:rsid w:val="00686291"/>
     <w:pPr>
       <w:pBdr>
         <w:top w:val="single" w:sz="4" w:space="10" w:color="0F4761" w:themeColor="accent1" w:themeShade="BF"/>
@@ -981,7 +981,7 @@
     <w:basedOn w:val="DefaultParagraphFont"/>
     <w:link w:val="IntenseQuote"/>
     <w:uiPriority w:val="30"/>
-    <w:rsid w:val="00A04ADF"/>
+    <w:rsid w:val="00686291"/>
     <w:rPr>
       <w:i/>
       <w:iCs/>
@@ -993,7 +993,7 @@
     <w:basedOn w:val="DefaultParagraphFont"/>
     <w:uiPriority w:val="32"/>
     <w:qFormat/>
-    <w:rsid w:val="00A04ADF"/>
+    <w:rsid w:val="00686291"/>
     <w:rPr>
       <w:b/>
       <w:bCs/>

</xml_diff>